<commit_message>
web design update + voucher update
</commit_message>
<xml_diff>
--- a/assets/voucher.docx
+++ b/assets/voucher.docx
@@ -902,7 +902,7 @@
         <mc:AlternateContent>
           <mc:Choice Requires="wps">
             <w:drawing>
-              <wp:anchor distT="0" distB="0" distL="114300" distR="114300" simplePos="0" relativeHeight="251659264" behindDoc="1" locked="0" layoutInCell="1" allowOverlap="1" wp14:anchorId="207E8ED7" wp14:editId="2CAEBBBC">
+              <wp:anchor distT="0" distB="0" distL="114300" distR="114300" simplePos="0" relativeHeight="251659264" behindDoc="1" locked="0" layoutInCell="1" allowOverlap="1" wp14:anchorId="207E8ED7" wp14:editId="3FF15ECC">
                 <wp:simplePos x="0" y="0"/>
                 <wp:positionH relativeFrom="column">
                   <wp:posOffset>-23854</wp:posOffset>
@@ -927,12 +927,14 @@
                         <a:prstGeom prst="rect">
                           <a:avLst/>
                         </a:prstGeom>
-                        <a:ln w="127000" cmpd="tri">
+                        <a:noFill/>
+                        <a:ln w="127000" cap="rnd" cmpd="tri">
                           <a:solidFill>
                             <a:schemeClr val="bg1">
                               <a:lumMod val="65000"/>
                             </a:schemeClr>
                           </a:solidFill>
+                          <a:prstDash val="solid"/>
                           <a:extLst>
                             <a:ext uri="{C807C97D-BFC1-408E-A445-0C87EB9F89A2}">
                               <ask:lineSketchStyleProps xmlns:ask="http://schemas.microsoft.com/office/drawing/2018/sketchyshapes" sd="1219033472">
@@ -941,68 +943,62 @@
                                   <a:gdLst>
                                     <a:gd name="csX0" fmla="*/ 0 w 5890437"/>
                                     <a:gd name="csY0" fmla="*/ 0 h 3508744"/>
-                                    <a:gd name="csX1" fmla="*/ 647948 w 5890437"/>
+                                    <a:gd name="csX1" fmla="*/ 477780 w 5890437"/>
                                     <a:gd name="csY1" fmla="*/ 0 h 3508744"/>
-                                    <a:gd name="csX2" fmla="*/ 1354801 w 5890437"/>
+                                    <a:gd name="csX2" fmla="*/ 1191177 w 5890437"/>
                                     <a:gd name="csY2" fmla="*/ 0 h 3508744"/>
-                                    <a:gd name="csX3" fmla="*/ 1826035 w 5890437"/>
+                                    <a:gd name="csX3" fmla="*/ 1786766 w 5890437"/>
                                     <a:gd name="csY3" fmla="*/ 0 h 3508744"/>
-                                    <a:gd name="csX4" fmla="*/ 2473984 w 5890437"/>
+                                    <a:gd name="csX4" fmla="*/ 2441259 w 5890437"/>
                                     <a:gd name="csY4" fmla="*/ 0 h 3508744"/>
-                                    <a:gd name="csX5" fmla="*/ 2945219 w 5890437"/>
+                                    <a:gd name="csX5" fmla="*/ 3213561 w 5890437"/>
                                     <a:gd name="csY5" fmla="*/ 0 h 3508744"/>
-                                    <a:gd name="csX6" fmla="*/ 3534262 w 5890437"/>
+                                    <a:gd name="csX6" fmla="*/ 3750245 w 5890437"/>
                                     <a:gd name="csY6" fmla="*/ 0 h 3508744"/>
-                                    <a:gd name="csX7" fmla="*/ 4182210 w 5890437"/>
+                                    <a:gd name="csX7" fmla="*/ 4463642 w 5890437"/>
                                     <a:gd name="csY7" fmla="*/ 0 h 3508744"/>
-                                    <a:gd name="csX8" fmla="*/ 4594541 w 5890437"/>
+                                    <a:gd name="csX8" fmla="*/ 5000327 w 5890437"/>
                                     <a:gd name="csY8" fmla="*/ 0 h 3508744"/>
-                                    <a:gd name="csX9" fmla="*/ 5006871 w 5890437"/>
+                                    <a:gd name="csX9" fmla="*/ 5890437 w 5890437"/>
                                     <a:gd name="csY9" fmla="*/ 0 h 3508744"/>
                                     <a:gd name="csX10" fmla="*/ 5890437 w 5890437"/>
-                                    <a:gd name="csY10" fmla="*/ 0 h 3508744"/>
+                                    <a:gd name="csY10" fmla="*/ 619878 h 3508744"/>
                                     <a:gd name="csX11" fmla="*/ 5890437 w 5890437"/>
-                                    <a:gd name="csY11" fmla="*/ 584791 h 3508744"/>
+                                    <a:gd name="csY11" fmla="*/ 1134494 h 3508744"/>
                                     <a:gd name="csX12" fmla="*/ 5890437 w 5890437"/>
-                                    <a:gd name="csY12" fmla="*/ 1204669 h 3508744"/>
+                                    <a:gd name="csY12" fmla="*/ 1789459 h 3508744"/>
                                     <a:gd name="csX13" fmla="*/ 5890437 w 5890437"/>
-                                    <a:gd name="csY13" fmla="*/ 1754372 h 3508744"/>
+                                    <a:gd name="csY13" fmla="*/ 2374250 h 3508744"/>
                                     <a:gd name="csX14" fmla="*/ 5890437 w 5890437"/>
-                                    <a:gd name="csY14" fmla="*/ 2374250 h 3508744"/>
-                                    <a:gd name="csX15" fmla="*/ 5890437 w 5890437"/>
-                                    <a:gd name="csY15" fmla="*/ 2888866 h 3508744"/>
-                                    <a:gd name="csX16" fmla="*/ 5890437 w 5890437"/>
+                                    <a:gd name="csY14" fmla="*/ 3508744 h 3508744"/>
+                                    <a:gd name="csX15" fmla="*/ 5177040 w 5890437"/>
+                                    <a:gd name="csY15" fmla="*/ 3508744 h 3508744"/>
+                                    <a:gd name="csX16" fmla="*/ 4522547 w 5890437"/>
                                     <a:gd name="csY16" fmla="*/ 3508744 h 3508744"/>
-                                    <a:gd name="csX17" fmla="*/ 5478106 w 5890437"/>
+                                    <a:gd name="csX17" fmla="*/ 3926958 w 5890437"/>
                                     <a:gd name="csY17" fmla="*/ 3508744 h 3508744"/>
-                                    <a:gd name="csX18" fmla="*/ 4771254 w 5890437"/>
+                                    <a:gd name="csX18" fmla="*/ 3213561 w 5890437"/>
                                     <a:gd name="csY18" fmla="*/ 3508744 h 3508744"/>
-                                    <a:gd name="csX19" fmla="*/ 4123306 w 5890437"/>
+                                    <a:gd name="csX19" fmla="*/ 2559068 w 5890437"/>
                                     <a:gd name="csY19" fmla="*/ 3508744 h 3508744"/>
-                                    <a:gd name="csX20" fmla="*/ 3475358 w 5890437"/>
+                                    <a:gd name="csX20" fmla="*/ 1786766 w 5890437"/>
                                     <a:gd name="csY20" fmla="*/ 3508744 h 3508744"/>
-                                    <a:gd name="csX21" fmla="*/ 2827410 w 5890437"/>
+                                    <a:gd name="csX21" fmla="*/ 1014464 w 5890437"/>
                                     <a:gd name="csY21" fmla="*/ 3508744 h 3508744"/>
-                                    <a:gd name="csX22" fmla="*/ 2356175 w 5890437"/>
+                                    <a:gd name="csX22" fmla="*/ 0 w 5890437"/>
                                     <a:gd name="csY22" fmla="*/ 3508744 h 3508744"/>
-                                    <a:gd name="csX23" fmla="*/ 1649322 w 5890437"/>
-                                    <a:gd name="csY23" fmla="*/ 3508744 h 3508744"/>
-                                    <a:gd name="csX24" fmla="*/ 1060279 w 5890437"/>
-                                    <a:gd name="csY24" fmla="*/ 3508744 h 3508744"/>
-                                    <a:gd name="csX25" fmla="*/ 647948 w 5890437"/>
-                                    <a:gd name="csY25" fmla="*/ 3508744 h 3508744"/>
+                                    <a:gd name="csX23" fmla="*/ 0 w 5890437"/>
+                                    <a:gd name="csY23" fmla="*/ 2888866 h 3508744"/>
+                                    <a:gd name="csX24" fmla="*/ 0 w 5890437"/>
+                                    <a:gd name="csY24" fmla="*/ 2268988 h 3508744"/>
+                                    <a:gd name="csX25" fmla="*/ 0 w 5890437"/>
+                                    <a:gd name="csY25" fmla="*/ 1684197 h 3508744"/>
                                     <a:gd name="csX26" fmla="*/ 0 w 5890437"/>
-                                    <a:gd name="csY26" fmla="*/ 3508744 h 3508744"/>
+                                    <a:gd name="csY26" fmla="*/ 1099406 h 3508744"/>
                                     <a:gd name="csX27" fmla="*/ 0 w 5890437"/>
-                                    <a:gd name="csY27" fmla="*/ 2959041 h 3508744"/>
+                                    <a:gd name="csY27" fmla="*/ 514616 h 3508744"/>
                                     <a:gd name="csX28" fmla="*/ 0 w 5890437"/>
-                                    <a:gd name="csY28" fmla="*/ 2374250 h 3508744"/>
-                                    <a:gd name="csX29" fmla="*/ 0 w 5890437"/>
-                                    <a:gd name="csY29" fmla="*/ 1719285 h 3508744"/>
-                                    <a:gd name="csX30" fmla="*/ 0 w 5890437"/>
-                                    <a:gd name="csY30" fmla="*/ 1064319 h 3508744"/>
-                                    <a:gd name="csX31" fmla="*/ 0 w 5890437"/>
-                                    <a:gd name="csY31" fmla="*/ 0 h 3508744"/>
+                                    <a:gd name="csY28" fmla="*/ 0 h 3508744"/>
                                   </a:gdLst>
                                   <a:ahLst/>
                                   <a:cxnLst>
@@ -1092,15 +1088,6 @@
                                     </a:cxn>
                                     <a:cxn ang="0">
                                       <a:pos x="csX28" y="csY28"/>
-                                    </a:cxn>
-                                    <a:cxn ang="0">
-                                      <a:pos x="csX29" y="csY29"/>
-                                    </a:cxn>
-                                    <a:cxn ang="0">
-                                      <a:pos x="csX30" y="csY30"/>
-                                    </a:cxn>
-                                    <a:cxn ang="0">
-                                      <a:pos x="csX31" y="csY31"/>
                                     </a:cxn>
                                   </a:cxnLst>
                                   <a:rect l="l" t="t" r="r" b="b"/>
@@ -1110,158 +1097,143 @@
                                         <a:pt x="0" y="0"/>
                                       </a:moveTo>
                                       <a:cubicBezTo>
-                                        <a:pt x="223925" y="-18320"/>
-                                        <a:pt x="385919" y="15360"/>
-                                        <a:pt x="647948" y="0"/>
-                                      </a:cubicBezTo>
-                                      <a:cubicBezTo>
-                                        <a:pt x="909977" y="-15360"/>
-                                        <a:pt x="1019991" y="68871"/>
-                                        <a:pt x="1354801" y="0"/>
-                                      </a:cubicBezTo>
-                                      <a:cubicBezTo>
-                                        <a:pt x="1689611" y="-68871"/>
-                                        <a:pt x="1621741" y="32612"/>
-                                        <a:pt x="1826035" y="0"/>
-                                      </a:cubicBezTo>
-                                      <a:cubicBezTo>
-                                        <a:pt x="2030329" y="-32612"/>
-                                        <a:pt x="2173819" y="47353"/>
-                                        <a:pt x="2473984" y="0"/>
-                                      </a:cubicBezTo>
-                                      <a:cubicBezTo>
-                                        <a:pt x="2774149" y="-47353"/>
-                                        <a:pt x="2800184" y="1913"/>
-                                        <a:pt x="2945219" y="0"/>
-                                      </a:cubicBezTo>
-                                      <a:cubicBezTo>
-                                        <a:pt x="3090254" y="-1913"/>
-                                        <a:pt x="3357557" y="33376"/>
-                                        <a:pt x="3534262" y="0"/>
-                                      </a:cubicBezTo>
-                                      <a:cubicBezTo>
-                                        <a:pt x="3710967" y="-33376"/>
-                                        <a:pt x="4048969" y="38894"/>
-                                        <a:pt x="4182210" y="0"/>
-                                      </a:cubicBezTo>
-                                      <a:cubicBezTo>
-                                        <a:pt x="4315451" y="-38894"/>
-                                        <a:pt x="4455497" y="33007"/>
-                                        <a:pt x="4594541" y="0"/>
-                                      </a:cubicBezTo>
-                                      <a:cubicBezTo>
-                                        <a:pt x="4733585" y="-33007"/>
-                                        <a:pt x="4859149" y="40537"/>
-                                        <a:pt x="5006871" y="0"/>
-                                      </a:cubicBezTo>
-                                      <a:cubicBezTo>
-                                        <a:pt x="5154593" y="-40537"/>
-                                        <a:pt x="5638683" y="26958"/>
+                                        <a:pt x="137998" y="-20334"/>
+                                        <a:pt x="380433" y="-10547"/>
+                                        <a:pt x="477780" y="0"/>
+                                      </a:cubicBezTo>
+                                      <a:cubicBezTo>
+                                        <a:pt x="575127" y="10547"/>
+                                        <a:pt x="976874" y="-17629"/>
+                                        <a:pt x="1191177" y="0"/>
+                                      </a:cubicBezTo>
+                                      <a:cubicBezTo>
+                                        <a:pt x="1405480" y="17629"/>
+                                        <a:pt x="1626873" y="-20081"/>
+                                        <a:pt x="1786766" y="0"/>
+                                      </a:cubicBezTo>
+                                      <a:cubicBezTo>
+                                        <a:pt x="1946659" y="20081"/>
+                                        <a:pt x="2226786" y="12510"/>
+                                        <a:pt x="2441259" y="0"/>
+                                      </a:cubicBezTo>
+                                      <a:cubicBezTo>
+                                        <a:pt x="2655732" y="-12510"/>
+                                        <a:pt x="2875790" y="24371"/>
+                                        <a:pt x="3213561" y="0"/>
+                                      </a:cubicBezTo>
+                                      <a:cubicBezTo>
+                                        <a:pt x="3551332" y="-24371"/>
+                                        <a:pt x="3590282" y="-1490"/>
+                                        <a:pt x="3750245" y="0"/>
+                                      </a:cubicBezTo>
+                                      <a:cubicBezTo>
+                                        <a:pt x="3910208" y="1490"/>
+                                        <a:pt x="4197690" y="-5147"/>
+                                        <a:pt x="4463642" y="0"/>
+                                      </a:cubicBezTo>
+                                      <a:cubicBezTo>
+                                        <a:pt x="4729594" y="5147"/>
+                                        <a:pt x="4888635" y="-3169"/>
+                                        <a:pt x="5000327" y="0"/>
+                                      </a:cubicBezTo>
+                                      <a:cubicBezTo>
+                                        <a:pt x="5112019" y="3169"/>
+                                        <a:pt x="5489430" y="16060"/>
                                         <a:pt x="5890437" y="0"/>
                                       </a:cubicBezTo>
                                       <a:cubicBezTo>
-                                        <a:pt x="5914817" y="167070"/>
-                                        <a:pt x="5841259" y="426050"/>
-                                        <a:pt x="5890437" y="584791"/>
-                                      </a:cubicBezTo>
-                                      <a:cubicBezTo>
-                                        <a:pt x="5939615" y="743532"/>
-                                        <a:pt x="5830173" y="944665"/>
-                                        <a:pt x="5890437" y="1204669"/>
-                                      </a:cubicBezTo>
-                                      <a:cubicBezTo>
-                                        <a:pt x="5950701" y="1464673"/>
-                                        <a:pt x="5879585" y="1511228"/>
-                                        <a:pt x="5890437" y="1754372"/>
-                                      </a:cubicBezTo>
-                                      <a:cubicBezTo>
-                                        <a:pt x="5901289" y="1997516"/>
-                                        <a:pt x="5848488" y="2069862"/>
+                                        <a:pt x="5906859" y="180917"/>
+                                        <a:pt x="5866514" y="399339"/>
+                                        <a:pt x="5890437" y="619878"/>
+                                      </a:cubicBezTo>
+                                      <a:cubicBezTo>
+                                        <a:pt x="5914360" y="840417"/>
+                                        <a:pt x="5904914" y="919987"/>
+                                        <a:pt x="5890437" y="1134494"/>
+                                      </a:cubicBezTo>
+                                      <a:cubicBezTo>
+                                        <a:pt x="5875960" y="1349001"/>
+                                        <a:pt x="5907791" y="1649367"/>
+                                        <a:pt x="5890437" y="1789459"/>
+                                      </a:cubicBezTo>
+                                      <a:cubicBezTo>
+                                        <a:pt x="5873083" y="1929551"/>
+                                        <a:pt x="5919466" y="2228925"/>
                                         <a:pt x="5890437" y="2374250"/>
                                       </a:cubicBezTo>
                                       <a:cubicBezTo>
-                                        <a:pt x="5932386" y="2678638"/>
-                                        <a:pt x="5856914" y="2772436"/>
-                                        <a:pt x="5890437" y="2888866"/>
-                                      </a:cubicBezTo>
-                                      <a:cubicBezTo>
-                                        <a:pt x="5923960" y="3005296"/>
-                                        <a:pt x="5828114" y="3250320"/>
+                                        <a:pt x="5861408" y="2519575"/>
+                                        <a:pt x="5926800" y="3059167"/>
                                         <a:pt x="5890437" y="3508744"/>
                                       </a:cubicBezTo>
                                       <a:cubicBezTo>
-                                        <a:pt x="5709005" y="3530864"/>
-                                        <a:pt x="5663410" y="3499555"/>
-                                        <a:pt x="5478106" y="3508744"/>
-                                      </a:cubicBezTo>
-                                      <a:cubicBezTo>
-                                        <a:pt x="5292802" y="3517933"/>
-                                        <a:pt x="5007399" y="3479356"/>
-                                        <a:pt x="4771254" y="3508744"/>
-                                      </a:cubicBezTo>
-                                      <a:cubicBezTo>
-                                        <a:pt x="4535109" y="3538132"/>
-                                        <a:pt x="4306769" y="3449463"/>
-                                        <a:pt x="4123306" y="3508744"/>
-                                      </a:cubicBezTo>
-                                      <a:cubicBezTo>
-                                        <a:pt x="3939843" y="3568025"/>
-                                        <a:pt x="3777615" y="3488465"/>
-                                        <a:pt x="3475358" y="3508744"/>
-                                      </a:cubicBezTo>
-                                      <a:cubicBezTo>
-                                        <a:pt x="3173101" y="3529023"/>
-                                        <a:pt x="3011220" y="3481088"/>
-                                        <a:pt x="2827410" y="3508744"/>
-                                      </a:cubicBezTo>
-                                      <a:cubicBezTo>
-                                        <a:pt x="2643600" y="3536400"/>
-                                        <a:pt x="2537032" y="3494801"/>
-                                        <a:pt x="2356175" y="3508744"/>
-                                      </a:cubicBezTo>
-                                      <a:cubicBezTo>
-                                        <a:pt x="2175318" y="3522687"/>
-                                        <a:pt x="1903741" y="3425226"/>
-                                        <a:pt x="1649322" y="3508744"/>
-                                      </a:cubicBezTo>
-                                      <a:cubicBezTo>
-                                        <a:pt x="1394903" y="3592262"/>
-                                        <a:pt x="1286869" y="3472813"/>
-                                        <a:pt x="1060279" y="3508744"/>
-                                      </a:cubicBezTo>
-                                      <a:cubicBezTo>
-                                        <a:pt x="833689" y="3544675"/>
-                                        <a:pt x="846035" y="3495651"/>
-                                        <a:pt x="647948" y="3508744"/>
-                                      </a:cubicBezTo>
-                                      <a:cubicBezTo>
-                                        <a:pt x="449861" y="3521837"/>
-                                        <a:pt x="241603" y="3502516"/>
+                                        <a:pt x="5712637" y="3480889"/>
+                                        <a:pt x="5369610" y="3481436"/>
+                                        <a:pt x="5177040" y="3508744"/>
+                                      </a:cubicBezTo>
+                                      <a:cubicBezTo>
+                                        <a:pt x="4984470" y="3536052"/>
+                                        <a:pt x="4841351" y="3479714"/>
+                                        <a:pt x="4522547" y="3508744"/>
+                                      </a:cubicBezTo>
+                                      <a:cubicBezTo>
+                                        <a:pt x="4203743" y="3537774"/>
+                                        <a:pt x="4181858" y="3505854"/>
+                                        <a:pt x="3926958" y="3508744"/>
+                                      </a:cubicBezTo>
+                                      <a:cubicBezTo>
+                                        <a:pt x="3672058" y="3511634"/>
+                                        <a:pt x="3509474" y="3489115"/>
+                                        <a:pt x="3213561" y="3508744"/>
+                                      </a:cubicBezTo>
+                                      <a:cubicBezTo>
+                                        <a:pt x="2917648" y="3528373"/>
+                                        <a:pt x="2848615" y="3483368"/>
+                                        <a:pt x="2559068" y="3508744"/>
+                                      </a:cubicBezTo>
+                                      <a:cubicBezTo>
+                                        <a:pt x="2269521" y="3534120"/>
+                                        <a:pt x="2039838" y="3502393"/>
+                                        <a:pt x="1786766" y="3508744"/>
+                                      </a:cubicBezTo>
+                                      <a:cubicBezTo>
+                                        <a:pt x="1533694" y="3515095"/>
+                                        <a:pt x="1259911" y="3492534"/>
+                                        <a:pt x="1014464" y="3508744"/>
+                                      </a:cubicBezTo>
+                                      <a:cubicBezTo>
+                                        <a:pt x="769017" y="3524954"/>
+                                        <a:pt x="493781" y="3483498"/>
                                         <a:pt x="0" y="3508744"/>
                                       </a:cubicBezTo>
                                       <a:cubicBezTo>
-                                        <a:pt x="-62075" y="3237089"/>
-                                        <a:pt x="38935" y="3125330"/>
-                                        <a:pt x="0" y="2959041"/>
-                                      </a:cubicBezTo>
-                                      <a:cubicBezTo>
-                                        <a:pt x="-38935" y="2792752"/>
-                                        <a:pt x="22160" y="2633928"/>
-                                        <a:pt x="0" y="2374250"/>
-                                      </a:cubicBezTo>
-                                      <a:cubicBezTo>
-                                        <a:pt x="-22160" y="2114572"/>
-                                        <a:pt x="10539" y="2039566"/>
-                                        <a:pt x="0" y="1719285"/>
-                                      </a:cubicBezTo>
-                                      <a:cubicBezTo>
-                                        <a:pt x="-10539" y="1399004"/>
-                                        <a:pt x="54182" y="1219862"/>
-                                        <a:pt x="0" y="1064319"/>
-                                      </a:cubicBezTo>
-                                      <a:cubicBezTo>
-                                        <a:pt x="-54182" y="908776"/>
-                                        <a:pt x="86176" y="528016"/>
+                                        <a:pt x="19027" y="3206595"/>
+                                        <a:pt x="-29603" y="3103459"/>
+                                        <a:pt x="0" y="2888866"/>
+                                      </a:cubicBezTo>
+                                      <a:cubicBezTo>
+                                        <a:pt x="29603" y="2674273"/>
+                                        <a:pt x="-647" y="2475896"/>
+                                        <a:pt x="0" y="2268988"/>
+                                      </a:cubicBezTo>
+                                      <a:cubicBezTo>
+                                        <a:pt x="647" y="2062080"/>
+                                        <a:pt x="-3700" y="1857989"/>
+                                        <a:pt x="0" y="1684197"/>
+                                      </a:cubicBezTo>
+                                      <a:cubicBezTo>
+                                        <a:pt x="3700" y="1510405"/>
+                                        <a:pt x="-1459" y="1389662"/>
+                                        <a:pt x="0" y="1099406"/>
+                                      </a:cubicBezTo>
+                                      <a:cubicBezTo>
+                                        <a:pt x="1459" y="809150"/>
+                                        <a:pt x="17418" y="773191"/>
+                                        <a:pt x="0" y="514616"/>
+                                      </a:cubicBezTo>
+                                      <a:cubicBezTo>
+                                        <a:pt x="-17418" y="256041"/>
+                                        <a:pt x="-19723" y="212455"/>
                                         <a:pt x="0" y="0"/>
                                       </a:cubicBezTo>
                                       <a:close/>
@@ -1271,168 +1243,153 @@
                                         <a:pt x="0" y="0"/>
                                       </a:moveTo>
                                       <a:cubicBezTo>
-                                        <a:pt x="164691" y="-27773"/>
-                                        <a:pt x="351609" y="62281"/>
-                                        <a:pt x="530139" y="0"/>
-                                      </a:cubicBezTo>
-                                      <a:cubicBezTo>
-                                        <a:pt x="708669" y="-62281"/>
-                                        <a:pt x="854585" y="22134"/>
-                                        <a:pt x="942470" y="0"/>
-                                      </a:cubicBezTo>
-                                      <a:cubicBezTo>
-                                        <a:pt x="1030355" y="-22134"/>
-                                        <a:pt x="1386757" y="35087"/>
-                                        <a:pt x="1649322" y="0"/>
-                                      </a:cubicBezTo>
-                                      <a:cubicBezTo>
-                                        <a:pt x="1911887" y="-35087"/>
-                                        <a:pt x="1916232" y="2191"/>
-                                        <a:pt x="2179462" y="0"/>
-                                      </a:cubicBezTo>
-                                      <a:cubicBezTo>
-                                        <a:pt x="2442692" y="-2191"/>
-                                        <a:pt x="2449832" y="9721"/>
-                                        <a:pt x="2709601" y="0"/>
-                                      </a:cubicBezTo>
-                                      <a:cubicBezTo>
-                                        <a:pt x="2969370" y="-9721"/>
-                                        <a:pt x="3063419" y="400"/>
-                                        <a:pt x="3416453" y="0"/>
-                                      </a:cubicBezTo>
-                                      <a:cubicBezTo>
-                                        <a:pt x="3769487" y="-400"/>
-                                        <a:pt x="3737400" y="31440"/>
-                                        <a:pt x="3887688" y="0"/>
-                                      </a:cubicBezTo>
-                                      <a:cubicBezTo>
-                                        <a:pt x="4037976" y="-31440"/>
-                                        <a:pt x="4264158" y="41215"/>
-                                        <a:pt x="4594541" y="0"/>
-                                      </a:cubicBezTo>
-                                      <a:cubicBezTo>
-                                        <a:pt x="4924924" y="-41215"/>
-                                        <a:pt x="5106422" y="33552"/>
-                                        <a:pt x="5301393" y="0"/>
-                                      </a:cubicBezTo>
-                                      <a:cubicBezTo>
-                                        <a:pt x="5496364" y="-33552"/>
-                                        <a:pt x="5750002" y="21805"/>
+                                        <a:pt x="161384" y="-8079"/>
+                                        <a:pt x="359878" y="-25138"/>
+                                        <a:pt x="595589" y="0"/>
+                                      </a:cubicBezTo>
+                                      <a:cubicBezTo>
+                                        <a:pt x="831300" y="25138"/>
+                                        <a:pt x="884137" y="-7912"/>
+                                        <a:pt x="1073369" y="0"/>
+                                      </a:cubicBezTo>
+                                      <a:cubicBezTo>
+                                        <a:pt x="1262601" y="7912"/>
+                                        <a:pt x="1622192" y="-36160"/>
+                                        <a:pt x="1845670" y="0"/>
+                                      </a:cubicBezTo>
+                                      <a:cubicBezTo>
+                                        <a:pt x="2069148" y="36160"/>
+                                        <a:pt x="2151146" y="-1010"/>
+                                        <a:pt x="2441259" y="0"/>
+                                      </a:cubicBezTo>
+                                      <a:cubicBezTo>
+                                        <a:pt x="2731372" y="1010"/>
+                                        <a:pt x="2794840" y="-5160"/>
+                                        <a:pt x="3036848" y="0"/>
+                                      </a:cubicBezTo>
+                                      <a:cubicBezTo>
+                                        <a:pt x="3278856" y="5160"/>
+                                        <a:pt x="3626101" y="32405"/>
+                                        <a:pt x="3809149" y="0"/>
+                                      </a:cubicBezTo>
+                                      <a:cubicBezTo>
+                                        <a:pt x="3992197" y="-32405"/>
+                                        <a:pt x="4185698" y="-12641"/>
+                                        <a:pt x="4345834" y="0"/>
+                                      </a:cubicBezTo>
+                                      <a:cubicBezTo>
+                                        <a:pt x="4505971" y="12641"/>
+                                        <a:pt x="4827881" y="14708"/>
+                                        <a:pt x="5118135" y="0"/>
+                                      </a:cubicBezTo>
+                                      <a:cubicBezTo>
+                                        <a:pt x="5408389" y="-14708"/>
+                                        <a:pt x="5504926" y="5666"/>
                                         <a:pt x="5890437" y="0"/>
                                       </a:cubicBezTo>
                                       <a:cubicBezTo>
-                                        <a:pt x="5923563" y="167549"/>
-                                        <a:pt x="5855341" y="490364"/>
-                                        <a:pt x="5890437" y="654966"/>
-                                      </a:cubicBezTo>
-                                      <a:cubicBezTo>
-                                        <a:pt x="5925533" y="819568"/>
-                                        <a:pt x="5880195" y="1132152"/>
-                                        <a:pt x="5890437" y="1274844"/>
-                                      </a:cubicBezTo>
-                                      <a:cubicBezTo>
-                                        <a:pt x="5900679" y="1417536"/>
-                                        <a:pt x="5884307" y="1600980"/>
-                                        <a:pt x="5890437" y="1754372"/>
-                                      </a:cubicBezTo>
-                                      <a:cubicBezTo>
-                                        <a:pt x="5896567" y="1907764"/>
-                                        <a:pt x="5878318" y="2075538"/>
-                                        <a:pt x="5890437" y="2339163"/>
-                                      </a:cubicBezTo>
-                                      <a:cubicBezTo>
-                                        <a:pt x="5902556" y="2602788"/>
-                                        <a:pt x="5857140" y="2768527"/>
-                                        <a:pt x="5890437" y="2923953"/>
-                                      </a:cubicBezTo>
-                                      <a:cubicBezTo>
-                                        <a:pt x="5923734" y="3079379"/>
-                                        <a:pt x="5872548" y="3391472"/>
+                                        <a:pt x="5870714" y="122828"/>
+                                        <a:pt x="5895466" y="305376"/>
+                                        <a:pt x="5890437" y="584791"/>
+                                      </a:cubicBezTo>
+                                      <a:cubicBezTo>
+                                        <a:pt x="5885408" y="864206"/>
+                                        <a:pt x="5903249" y="882278"/>
+                                        <a:pt x="5890437" y="1169581"/>
+                                      </a:cubicBezTo>
+                                      <a:cubicBezTo>
+                                        <a:pt x="5877626" y="1456884"/>
+                                        <a:pt x="5911189" y="1646767"/>
+                                        <a:pt x="5890437" y="1789459"/>
+                                      </a:cubicBezTo>
+                                      <a:cubicBezTo>
+                                        <a:pt x="5869685" y="1932151"/>
+                                        <a:pt x="5892567" y="2109909"/>
+                                        <a:pt x="5890437" y="2268988"/>
+                                      </a:cubicBezTo>
+                                      <a:cubicBezTo>
+                                        <a:pt x="5888307" y="2428067"/>
+                                        <a:pt x="5868225" y="2592237"/>
+                                        <a:pt x="5890437" y="2853778"/>
+                                      </a:cubicBezTo>
+                                      <a:cubicBezTo>
+                                        <a:pt x="5912650" y="3115319"/>
+                                        <a:pt x="5912658" y="3317522"/>
                                         <a:pt x="5890437" y="3508744"/>
                                       </a:cubicBezTo>
                                       <a:cubicBezTo>
-                                        <a:pt x="5606304" y="3511997"/>
-                                        <a:pt x="5386236" y="3499528"/>
-                                        <a:pt x="5242489" y="3508744"/>
-                                      </a:cubicBezTo>
-                                      <a:cubicBezTo>
-                                        <a:pt x="5098742" y="3517960"/>
-                                        <a:pt x="4881172" y="3456638"/>
-                                        <a:pt x="4653445" y="3508744"/>
-                                      </a:cubicBezTo>
-                                      <a:cubicBezTo>
-                                        <a:pt x="4425718" y="3560850"/>
-                                        <a:pt x="4336924" y="3459670"/>
-                                        <a:pt x="4241115" y="3508744"/>
-                                      </a:cubicBezTo>
-                                      <a:cubicBezTo>
-                                        <a:pt x="4145306" y="3557818"/>
-                                        <a:pt x="3903697" y="3508543"/>
-                                        <a:pt x="3769880" y="3508744"/>
-                                      </a:cubicBezTo>
-                                      <a:cubicBezTo>
-                                        <a:pt x="3636064" y="3508945"/>
-                                        <a:pt x="3296724" y="3476087"/>
-                                        <a:pt x="3063027" y="3508744"/>
-                                      </a:cubicBezTo>
-                                      <a:cubicBezTo>
-                                        <a:pt x="2829330" y="3541401"/>
-                                        <a:pt x="2749262" y="3498940"/>
-                                        <a:pt x="2473984" y="3508744"/>
-                                      </a:cubicBezTo>
-                                      <a:cubicBezTo>
-                                        <a:pt x="2198706" y="3518548"/>
-                                        <a:pt x="2198547" y="3478545"/>
-                                        <a:pt x="2002749" y="3508744"/>
-                                      </a:cubicBezTo>
-                                      <a:cubicBezTo>
-                                        <a:pt x="1806952" y="3538943"/>
-                                        <a:pt x="1550392" y="3495308"/>
-                                        <a:pt x="1413705" y="3508744"/>
-                                      </a:cubicBezTo>
-                                      <a:cubicBezTo>
-                                        <a:pt x="1277018" y="3522180"/>
-                                        <a:pt x="1200059" y="3487514"/>
-                                        <a:pt x="1001374" y="3508744"/>
-                                      </a:cubicBezTo>
-                                      <a:cubicBezTo>
-                                        <a:pt x="802689" y="3529974"/>
-                                        <a:pt x="733020" y="3472392"/>
-                                        <a:pt x="589044" y="3508744"/>
-                                      </a:cubicBezTo>
-                                      <a:cubicBezTo>
-                                        <a:pt x="445068" y="3545096"/>
-                                        <a:pt x="260269" y="3469697"/>
+                                        <a:pt x="5702328" y="3484009"/>
+                                        <a:pt x="5470425" y="3505407"/>
+                                        <a:pt x="5235944" y="3508744"/>
+                                      </a:cubicBezTo>
+                                      <a:cubicBezTo>
+                                        <a:pt x="5001463" y="3512081"/>
+                                        <a:pt x="4771216" y="3544771"/>
+                                        <a:pt x="4463642" y="3508744"/>
+                                      </a:cubicBezTo>
+                                      <a:cubicBezTo>
+                                        <a:pt x="4156068" y="3472717"/>
+                                        <a:pt x="4007866" y="3520223"/>
+                                        <a:pt x="3809149" y="3508744"/>
+                                      </a:cubicBezTo>
+                                      <a:cubicBezTo>
+                                        <a:pt x="3610432" y="3497265"/>
+                                        <a:pt x="3548893" y="3496926"/>
+                                        <a:pt x="3331369" y="3508744"/>
+                                      </a:cubicBezTo>
+                                      <a:cubicBezTo>
+                                        <a:pt x="3113845" y="3520562"/>
+                                        <a:pt x="3058179" y="3498688"/>
+                                        <a:pt x="2794685" y="3508744"/>
+                                      </a:cubicBezTo>
+                                      <a:cubicBezTo>
+                                        <a:pt x="2531191" y="3518800"/>
+                                        <a:pt x="2195956" y="3481930"/>
+                                        <a:pt x="2022383" y="3508744"/>
+                                      </a:cubicBezTo>
+                                      <a:cubicBezTo>
+                                        <a:pt x="1848810" y="3535558"/>
+                                        <a:pt x="1538596" y="3519068"/>
+                                        <a:pt x="1367890" y="3508744"/>
+                                      </a:cubicBezTo>
+                                      <a:cubicBezTo>
+                                        <a:pt x="1197184" y="3498420"/>
+                                        <a:pt x="1044108" y="3483807"/>
+                                        <a:pt x="831206" y="3508744"/>
+                                      </a:cubicBezTo>
+                                      <a:cubicBezTo>
+                                        <a:pt x="618304" y="3533681"/>
+                                        <a:pt x="371823" y="3495606"/>
                                         <a:pt x="0" y="3508744"/>
                                       </a:cubicBezTo>
                                       <a:cubicBezTo>
-                                        <a:pt x="-20684" y="3267582"/>
-                                        <a:pt x="11726" y="3225252"/>
-                                        <a:pt x="0" y="2994128"/>
-                                      </a:cubicBezTo>
-                                      <a:cubicBezTo>
-                                        <a:pt x="-11726" y="2763004"/>
-                                        <a:pt x="77307" y="2595840"/>
-                                        <a:pt x="0" y="2339163"/>
-                                      </a:cubicBezTo>
-                                      <a:cubicBezTo>
-                                        <a:pt x="-77307" y="2082487"/>
-                                        <a:pt x="24750" y="1925734"/>
-                                        <a:pt x="0" y="1789459"/>
-                                      </a:cubicBezTo>
-                                      <a:cubicBezTo>
-                                        <a:pt x="-24750" y="1653184"/>
-                                        <a:pt x="34232" y="1482310"/>
-                                        <a:pt x="0" y="1309931"/>
-                                      </a:cubicBezTo>
-                                      <a:cubicBezTo>
-                                        <a:pt x="-34232" y="1137552"/>
-                                        <a:pt x="28824" y="961648"/>
-                                        <a:pt x="0" y="690053"/>
-                                      </a:cubicBezTo>
-                                      <a:cubicBezTo>
-                                        <a:pt x="-28824" y="418458"/>
-                                        <a:pt x="77940" y="307724"/>
+                                        <a:pt x="-4126" y="3404082"/>
+                                        <a:pt x="-14695" y="3185286"/>
+                                        <a:pt x="0" y="3029216"/>
+                                      </a:cubicBezTo>
+                                      <a:cubicBezTo>
+                                        <a:pt x="14695" y="2873146"/>
+                                        <a:pt x="-19436" y="2655352"/>
+                                        <a:pt x="0" y="2549687"/>
+                                      </a:cubicBezTo>
+                                      <a:cubicBezTo>
+                                        <a:pt x="19436" y="2444022"/>
+                                        <a:pt x="-21202" y="2178893"/>
+                                        <a:pt x="0" y="1929809"/>
+                                      </a:cubicBezTo>
+                                      <a:cubicBezTo>
+                                        <a:pt x="21202" y="1680725"/>
+                                        <a:pt x="-24297" y="1646317"/>
+                                        <a:pt x="0" y="1415193"/>
+                                      </a:cubicBezTo>
+                                      <a:cubicBezTo>
+                                        <a:pt x="24297" y="1184069"/>
+                                        <a:pt x="18360" y="1016905"/>
+                                        <a:pt x="0" y="760228"/>
+                                      </a:cubicBezTo>
+                                      <a:cubicBezTo>
+                                        <a:pt x="-18360" y="503552"/>
+                                        <a:pt x="16857" y="334471"/>
                                         <a:pt x="0" y="0"/>
                                       </a:cubicBezTo>
                                       <a:close/>
@@ -1446,6 +1403,7 @@
                             </a:ext>
                           </a:extLst>
                         </a:ln>
+                        <a:effectLst/>
                       </wps:spPr>
                       <wps:style>
                         <a:lnRef idx="2">
@@ -1475,8 +1433,8 @@
           </mc:Choice>
           <mc:Fallback>
             <w:pict>
-              <v:rect w14:anchorId="1973A441" id="Rectangle 2" o:spid="_x0000_s1026" style="position:absolute;margin-left:-1.9pt;margin-top:3.15pt;width:463.8pt;height:276.3pt;z-index:-251657216;visibility:visible;mso-wrap-style:square;mso-wrap-distance-left:9pt;mso-wrap-distance-top:0;mso-wrap-distance-right:9pt;mso-wrap-distance-bottom:0;mso-position-horizontal:absolute;mso-position-horizontal-relative:text;mso-position-vertical:absolute;mso-position-vertical-relative:text;v-text-anchor:middle" o:gfxdata="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" fillcolor="white [3201]" strokecolor="#a5a5a5 [2092]" strokeweight="10pt">
-                <v:stroke linestyle="thickBetweenThin"/>
+              <v:rect w14:anchorId="6AAB6009" id="Rectangle 2" o:spid="_x0000_s1026" style="position:absolute;margin-left:-1.9pt;margin-top:3.15pt;width:463.8pt;height:276.3pt;z-index:-251657216;visibility:visible;mso-wrap-style:square;mso-wrap-distance-left:9pt;mso-wrap-distance-top:0;mso-wrap-distance-right:9pt;mso-wrap-distance-bottom:0;mso-position-horizontal:absolute;mso-position-horizontal-relative:text;mso-position-vertical:absolute;mso-position-vertical-relative:text;v-text-anchor:middle" o:gfxdata="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" filled="f" strokecolor="#a5a5a5 [2092]" strokeweight="10pt">
+                <v:stroke linestyle="thickBetweenThin" endcap="round"/>
               </v:rect>
             </w:pict>
           </mc:Fallback>

</xml_diff>

<commit_message>
prices, voucher docx updated, design of intro in html updated
</commit_message>
<xml_diff>
--- a/assets/voucher.docx
+++ b/assets/voucher.docx
@@ -7,510 +7,18 @@
         <w:rPr>
           <w:noProof/>
         </w:rPr>
-        <w:drawing>
-          <wp:anchor distT="0" distB="0" distL="114300" distR="114300" simplePos="0" relativeHeight="251667456" behindDoc="1" locked="0" layoutInCell="1" allowOverlap="1" wp14:anchorId="106A6ED0" wp14:editId="5DC38ACE">
-            <wp:simplePos x="0" y="0"/>
-            <wp:positionH relativeFrom="margin">
-              <wp:posOffset>50242</wp:posOffset>
-            </wp:positionH>
-            <wp:positionV relativeFrom="paragraph">
-              <wp:posOffset>105508</wp:posOffset>
-            </wp:positionV>
-            <wp:extent cx="1371600" cy="1411989"/>
-            <wp:effectExtent l="0" t="0" r="0" b="0"/>
-            <wp:wrapNone/>
-            <wp:docPr id="1629489188" name="Picture 3"/>
-            <wp:cNvGraphicFramePr>
-              <a:graphicFrameLocks xmlns:a="http://schemas.openxmlformats.org/drawingml/2006/main" noChangeAspect="1"/>
-            </wp:cNvGraphicFramePr>
-            <a:graphic xmlns:a="http://schemas.openxmlformats.org/drawingml/2006/main">
-              <a:graphicData uri="http://schemas.openxmlformats.org/drawingml/2006/picture">
-                <pic:pic xmlns:pic="http://schemas.openxmlformats.org/drawingml/2006/picture">
-                  <pic:nvPicPr>
-                    <pic:cNvPr id="0" name="Picture 2"/>
-                    <pic:cNvPicPr>
-                      <a:picLocks noChangeAspect="1" noChangeArrowheads="1"/>
-                    </pic:cNvPicPr>
-                  </pic:nvPicPr>
-                  <pic:blipFill>
-                    <a:blip r:embed="rId4" cstate="print">
-                      <a:extLst>
-                        <a:ext uri="{28A0092B-C50C-407E-A947-70E740481C1C}">
-                          <a14:useLocalDpi xmlns:a14="http://schemas.microsoft.com/office/drawing/2010/main" val="0"/>
-                        </a:ext>
-                      </a:extLst>
-                    </a:blip>
-                    <a:srcRect/>
-                    <a:stretch>
-                      <a:fillRect/>
-                    </a:stretch>
-                  </pic:blipFill>
-                  <pic:spPr bwMode="auto">
-                    <a:xfrm>
-                      <a:off x="0" y="0"/>
-                      <a:ext cx="1384932" cy="1425714"/>
-                    </a:xfrm>
-                    <a:prstGeom prst="rect">
-                      <a:avLst/>
-                    </a:prstGeom>
-                    <a:noFill/>
-                    <a:ln>
-                      <a:noFill/>
-                    </a:ln>
-                  </pic:spPr>
-                </pic:pic>
-              </a:graphicData>
-            </a:graphic>
-            <wp14:sizeRelH relativeFrom="page">
-              <wp14:pctWidth>0</wp14:pctWidth>
-            </wp14:sizeRelH>
-            <wp14:sizeRelV relativeFrom="page">
-              <wp14:pctHeight>0</wp14:pctHeight>
-            </wp14:sizeRelV>
-          </wp:anchor>
-        </w:drawing>
-      </w:r>
-      <w:r>
-        <w:drawing>
-          <wp:anchor distT="0" distB="0" distL="114300" distR="114300" simplePos="0" relativeHeight="251666432" behindDoc="1" locked="0" layoutInCell="1" allowOverlap="1" wp14:anchorId="41995536" wp14:editId="482803E7">
-            <wp:simplePos x="0" y="0"/>
-            <wp:positionH relativeFrom="column">
-              <wp:posOffset>3856024</wp:posOffset>
-            </wp:positionH>
-            <wp:positionV relativeFrom="paragraph">
-              <wp:posOffset>110794</wp:posOffset>
-            </wp:positionV>
-            <wp:extent cx="1947957" cy="1773140"/>
-            <wp:effectExtent l="0" t="0" r="0" b="0"/>
-            <wp:wrapNone/>
-            <wp:docPr id="537246363" name="Picture 1"/>
-            <wp:cNvGraphicFramePr>
-              <a:graphicFrameLocks xmlns:a="http://schemas.openxmlformats.org/drawingml/2006/main" noChangeAspect="1"/>
-            </wp:cNvGraphicFramePr>
-            <a:graphic xmlns:a="http://schemas.openxmlformats.org/drawingml/2006/main">
-              <a:graphicData uri="http://schemas.openxmlformats.org/drawingml/2006/picture">
-                <pic:pic xmlns:pic="http://schemas.openxmlformats.org/drawingml/2006/picture">
-                  <pic:nvPicPr>
-                    <pic:cNvPr id="537246363" name=""/>
-                    <pic:cNvPicPr/>
-                  </pic:nvPicPr>
-                  <pic:blipFill>
-                    <a:blip r:embed="rId5" cstate="print">
-                      <a:extLst>
-                        <a:ext uri="{28A0092B-C50C-407E-A947-70E740481C1C}">
-                          <a14:useLocalDpi xmlns:a14="http://schemas.microsoft.com/office/drawing/2010/main" val="0"/>
-                        </a:ext>
-                      </a:extLst>
-                    </a:blip>
-                    <a:stretch>
-                      <a:fillRect/>
-                    </a:stretch>
-                  </pic:blipFill>
-                  <pic:spPr>
-                    <a:xfrm rot="10800000">
-                      <a:off x="0" y="0"/>
-                      <a:ext cx="1947957" cy="1773140"/>
-                    </a:xfrm>
-                    <a:prstGeom prst="rect">
-                      <a:avLst/>
-                    </a:prstGeom>
-                  </pic:spPr>
-                </pic:pic>
-              </a:graphicData>
-            </a:graphic>
-            <wp14:sizeRelH relativeFrom="page">
-              <wp14:pctWidth>0</wp14:pctWidth>
-            </wp14:sizeRelH>
-            <wp14:sizeRelV relativeFrom="page">
-              <wp14:pctHeight>0</wp14:pctHeight>
-            </wp14:sizeRelV>
-          </wp:anchor>
-        </w:drawing>
-      </w:r>
-      <w:r>
-        <w:rPr>
-          <w:noProof/>
-        </w:rPr>
         <mc:AlternateContent>
           <mc:Choice Requires="wps">
             <w:drawing>
-              <wp:anchor distT="45720" distB="45720" distL="114300" distR="114300" simplePos="0" relativeHeight="251663360" behindDoc="0" locked="0" layoutInCell="1" allowOverlap="1" wp14:anchorId="70EFD44E" wp14:editId="102A3DDD">
+              <wp:anchor distT="45720" distB="45720" distL="114300" distR="114300" simplePos="0" relativeHeight="251665408" behindDoc="0" locked="0" layoutInCell="1" allowOverlap="1" wp14:anchorId="2EEFA056" wp14:editId="155B5D97">
                 <wp:simplePos x="0" y="0"/>
                 <wp:positionH relativeFrom="margin">
                   <wp:align>left</wp:align>
                 </wp:positionH>
                 <wp:positionV relativeFrom="paragraph">
-                  <wp:posOffset>2759075</wp:posOffset>
+                  <wp:posOffset>1600605</wp:posOffset>
                 </wp:positionV>
-                <wp:extent cx="5835650" cy="675640"/>
-                <wp:effectExtent l="0" t="0" r="0" b="0"/>
-                <wp:wrapSquare wrapText="bothSides"/>
-                <wp:docPr id="1512035199" name="Text Box 2"/>
-                <wp:cNvGraphicFramePr>
-                  <a:graphicFrameLocks xmlns:a="http://schemas.openxmlformats.org/drawingml/2006/main"/>
-                </wp:cNvGraphicFramePr>
-                <a:graphic xmlns:a="http://schemas.openxmlformats.org/drawingml/2006/main">
-                  <a:graphicData uri="http://schemas.microsoft.com/office/word/2010/wordprocessingShape">
-                    <wps:wsp>
-                      <wps:cNvSpPr txBox="1">
-                        <a:spLocks noChangeArrowheads="1"/>
-                      </wps:cNvSpPr>
-                      <wps:spPr bwMode="auto">
-                        <a:xfrm>
-                          <a:off x="0" y="0"/>
-                          <a:ext cx="5835650" cy="675640"/>
-                        </a:xfrm>
-                        <a:prstGeom prst="rect">
-                          <a:avLst/>
-                        </a:prstGeom>
-                        <a:noFill/>
-                        <a:ln w="9525">
-                          <a:noFill/>
-                          <a:miter lim="800000"/>
-                          <a:headEnd/>
-                          <a:tailEnd/>
-                        </a:ln>
-                      </wps:spPr>
-                      <wps:txbx>
-                        <w:txbxContent>
-                          <w:p>
-                            <w:pPr>
-                              <w:spacing w:after="0"/>
-                              <w:jc w:val="center"/>
-                              <w:rPr>
-                                <w:rFonts w:ascii="Abadi ExtraLight" w:hAnsi="Abadi ExtraLight"/>
-                                <w:sz w:val="26"/>
-                                <w:szCs w:val="26"/>
-                                <w:lang w:val="cs-CZ"/>
-                              </w:rPr>
-                            </w:pPr>
-                            <w:r>
-                              <w:rPr>
-                                <w:rFonts w:ascii="Abadi ExtraLight" w:hAnsi="Abadi ExtraLight"/>
-                                <w:sz w:val="26"/>
-                                <w:szCs w:val="26"/>
-                                <w:lang w:val="cs-CZ"/>
-                              </w:rPr>
-                              <w:t xml:space="preserve">Pedikúra Orlová, tel.: </w:t>
-                            </w:r>
-                            <w:r>
-                              <w:rPr>
-                                <w:rFonts w:ascii="Abadi ExtraLight" w:hAnsi="Abadi ExtraLight"/>
-                                <w:sz w:val="26"/>
-                                <w:szCs w:val="26"/>
-                                <w:lang w:val="cs-CZ"/>
-                              </w:rPr>
-                              <w:t xml:space="preserve">+420 </w:t>
-                            </w:r>
-                            <w:r>
-                              <w:rPr>
-                                <w:rFonts w:ascii="Abadi ExtraLight" w:hAnsi="Abadi ExtraLight"/>
-                                <w:b/>
-                                <w:bCs/>
-                                <w:sz w:val="26"/>
-                                <w:szCs w:val="26"/>
-                                <w:lang w:val="cs-CZ"/>
-                              </w:rPr>
-                              <w:t>725 510 642</w:t>
-                            </w:r>
-                          </w:p>
-                          <w:p>
-                            <w:pPr>
-                              <w:spacing w:after="0"/>
-                              <w:jc w:val="center"/>
-                              <w:rPr>
-                                <w:rFonts w:ascii="Abadi ExtraLight" w:hAnsi="Abadi ExtraLight"/>
-                                <w:sz w:val="26"/>
-                                <w:szCs w:val="26"/>
-                              </w:rPr>
-                            </w:pPr>
-                            <w:r>
-                              <w:rPr>
-                                <w:rFonts w:ascii="Abadi ExtraLight" w:hAnsi="Abadi ExtraLight"/>
-                                <w:sz w:val="26"/>
-                                <w:szCs w:val="26"/>
-                                <w:lang w:val="cs-CZ"/>
-                              </w:rPr>
-                              <w:t>email: r.osinova</w:t>
-                            </w:r>
-                            <w:r>
-                              <w:rPr>
-                                <w:rFonts w:ascii="Abadi ExtraLight" w:hAnsi="Abadi ExtraLight"/>
-                                <w:sz w:val="26"/>
-                                <w:szCs w:val="26"/>
-                              </w:rPr>
-                              <w:t xml:space="preserve">@seznam.cz, </w:t>
-                            </w:r>
-                            <w:r>
-                              <w:rPr>
-                                <w:rFonts w:ascii="Abadi ExtraLight" w:hAnsi="Abadi ExtraLight"/>
-                                <w:sz w:val="26"/>
-                                <w:szCs w:val="26"/>
-                                <w:lang w:val="cs-CZ"/>
-                              </w:rPr>
-                              <w:t>www.</w:t>
-                            </w:r>
-                            <w:r>
-                              <w:rPr>
-                                <w:rFonts w:ascii="Abadi ExtraLight" w:hAnsi="Abadi ExtraLight"/>
-                                <w:color w:val="215E99" w:themeColor="text2" w:themeTint="BF"/>
-                                <w:sz w:val="26"/>
-                                <w:szCs w:val="26"/>
-                                <w:lang w:val="cs-CZ"/>
-                              </w:rPr>
-                              <w:t>PedikuraOrlova</w:t>
-                            </w:r>
-                            <w:r>
-                              <w:rPr>
-                                <w:rFonts w:ascii="Abadi ExtraLight" w:hAnsi="Abadi ExtraLight"/>
-                                <w:sz w:val="26"/>
-                                <w:szCs w:val="26"/>
-                                <w:lang w:val="cs-CZ"/>
-                              </w:rPr>
-                              <w:t>.cz</w:t>
-                            </w:r>
-                            <w:r>
-                              <w:rPr>
-                                <w:rFonts w:ascii="Abadi ExtraLight" w:hAnsi="Abadi ExtraLight"/>
-                                <w:sz w:val="26"/>
-                                <w:szCs w:val="26"/>
-                                <w:lang w:val="cs-CZ"/>
-                              </w:rPr>
-                              <w:br/>
-                            </w:r>
-                            <w:r>
-                              <w:rPr>
-                                <w:rFonts w:ascii="Abadi ExtraLight" w:hAnsi="Abadi ExtraLight"/>
-                                <w:sz w:val="26"/>
-                                <w:szCs w:val="26"/>
-                                <w:lang w:val="cs-CZ"/>
-                              </w:rPr>
-                              <w:t>Masarykova tř. 900</w:t>
-                            </w:r>
-                            <w:r>
-                              <w:rPr>
-                                <w:rFonts w:ascii="Abadi ExtraLight" w:hAnsi="Abadi ExtraLight"/>
-                                <w:sz w:val="26"/>
-                                <w:szCs w:val="26"/>
-                                <w:lang w:val="cs-CZ"/>
-                              </w:rPr>
-                              <w:t xml:space="preserve"> Orlová-</w:t>
-                            </w:r>
-                            <w:proofErr w:type="gramStart"/>
-                            <w:r>
-                              <w:rPr>
-                                <w:rFonts w:ascii="Abadi ExtraLight" w:hAnsi="Abadi ExtraLight"/>
-                                <w:sz w:val="26"/>
-                                <w:szCs w:val="26"/>
-                                <w:lang w:val="cs-CZ"/>
-                              </w:rPr>
-                              <w:t>4-Lutyně</w:t>
-                            </w:r>
-                            <w:proofErr w:type="gramEnd"/>
-                            <w:r>
-                              <w:rPr>
-                                <w:rFonts w:ascii="Abadi ExtraLight" w:hAnsi="Abadi ExtraLight"/>
-                                <w:sz w:val="26"/>
-                                <w:szCs w:val="26"/>
-                                <w:lang w:val="cs-CZ"/>
-                              </w:rPr>
-                              <w:t xml:space="preserve"> (vchod od ul. 17 listopadu)</w:t>
-                            </w:r>
-                          </w:p>
-                        </w:txbxContent>
-                      </wps:txbx>
-                      <wps:bodyPr rot="0" vert="horz" wrap="square" lIns="91440" tIns="45720" rIns="91440" bIns="45720" anchor="t" anchorCtr="0">
-                        <a:noAutofit/>
-                      </wps:bodyPr>
-                    </wps:wsp>
-                  </a:graphicData>
-                </a:graphic>
-                <wp14:sizeRelH relativeFrom="margin">
-                  <wp14:pctWidth>0</wp14:pctWidth>
-                </wp14:sizeRelH>
-                <wp14:sizeRelV relativeFrom="margin">
-                  <wp14:pctHeight>0</wp14:pctHeight>
-                </wp14:sizeRelV>
-              </wp:anchor>
-            </w:drawing>
-          </mc:Choice>
-          <mc:Fallback>
-            <w:pict>
-              <v:shapetype w14:anchorId="70EFD44E" id="_x0000_t202" coordsize="21600,21600" o:spt="202" path="m,l,21600r21600,l21600,xe">
-                <v:stroke joinstyle="miter"/>
-                <v:path gradientshapeok="t" o:connecttype="rect"/>
-              </v:shapetype>
-              <v:shape id="Text Box 2" o:spid="_x0000_s1026" type="#_x0000_t202" style="position:absolute;margin-left:0;margin-top:217.25pt;width:459.5pt;height:53.2pt;z-index:251663360;visibility:visible;mso-wrap-style:square;mso-width-percent:0;mso-height-percent:0;mso-wrap-distance-left:9pt;mso-wrap-distance-top:3.6pt;mso-wrap-distance-right:9pt;mso-wrap-distance-bottom:3.6pt;mso-position-horizontal:left;mso-position-horizontal-relative:margin;mso-position-vertical:absolute;mso-position-vertical-relative:text;mso-width-percent:0;mso-height-percent:0;mso-width-relative:margin;mso-height-relative:margin;v-text-anchor:top" o:gfxdata="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" filled="f" stroked="f">
-                <v:textbox>
-                  <w:txbxContent>
-                    <w:p>
-                      <w:pPr>
-                        <w:spacing w:after="0"/>
-                        <w:jc w:val="center"/>
-                        <w:rPr>
-                          <w:rFonts w:ascii="Abadi ExtraLight" w:hAnsi="Abadi ExtraLight"/>
-                          <w:sz w:val="26"/>
-                          <w:szCs w:val="26"/>
-                          <w:lang w:val="cs-CZ"/>
-                        </w:rPr>
-                      </w:pPr>
-                      <w:r>
-                        <w:rPr>
-                          <w:rFonts w:ascii="Abadi ExtraLight" w:hAnsi="Abadi ExtraLight"/>
-                          <w:sz w:val="26"/>
-                          <w:szCs w:val="26"/>
-                          <w:lang w:val="cs-CZ"/>
-                        </w:rPr>
-                        <w:t xml:space="preserve">Pedikúra Orlová, tel.: </w:t>
-                      </w:r>
-                      <w:r>
-                        <w:rPr>
-                          <w:rFonts w:ascii="Abadi ExtraLight" w:hAnsi="Abadi ExtraLight"/>
-                          <w:sz w:val="26"/>
-                          <w:szCs w:val="26"/>
-                          <w:lang w:val="cs-CZ"/>
-                        </w:rPr>
-                        <w:t xml:space="preserve">+420 </w:t>
-                      </w:r>
-                      <w:r>
-                        <w:rPr>
-                          <w:rFonts w:ascii="Abadi ExtraLight" w:hAnsi="Abadi ExtraLight"/>
-                          <w:b/>
-                          <w:bCs/>
-                          <w:sz w:val="26"/>
-                          <w:szCs w:val="26"/>
-                          <w:lang w:val="cs-CZ"/>
-                        </w:rPr>
-                        <w:t>725 510 642</w:t>
-                      </w:r>
-                    </w:p>
-                    <w:p>
-                      <w:pPr>
-                        <w:spacing w:after="0"/>
-                        <w:jc w:val="center"/>
-                        <w:rPr>
-                          <w:rFonts w:ascii="Abadi ExtraLight" w:hAnsi="Abadi ExtraLight"/>
-                          <w:sz w:val="26"/>
-                          <w:szCs w:val="26"/>
-                        </w:rPr>
-                      </w:pPr>
-                      <w:r>
-                        <w:rPr>
-                          <w:rFonts w:ascii="Abadi ExtraLight" w:hAnsi="Abadi ExtraLight"/>
-                          <w:sz w:val="26"/>
-                          <w:szCs w:val="26"/>
-                          <w:lang w:val="cs-CZ"/>
-                        </w:rPr>
-                        <w:t>email: r.osinova</w:t>
-                      </w:r>
-                      <w:r>
-                        <w:rPr>
-                          <w:rFonts w:ascii="Abadi ExtraLight" w:hAnsi="Abadi ExtraLight"/>
-                          <w:sz w:val="26"/>
-                          <w:szCs w:val="26"/>
-                        </w:rPr>
-                        <w:t xml:space="preserve">@seznam.cz, </w:t>
-                      </w:r>
-                      <w:r>
-                        <w:rPr>
-                          <w:rFonts w:ascii="Abadi ExtraLight" w:hAnsi="Abadi ExtraLight"/>
-                          <w:sz w:val="26"/>
-                          <w:szCs w:val="26"/>
-                          <w:lang w:val="cs-CZ"/>
-                        </w:rPr>
-                        <w:t>www.</w:t>
-                      </w:r>
-                      <w:r>
-                        <w:rPr>
-                          <w:rFonts w:ascii="Abadi ExtraLight" w:hAnsi="Abadi ExtraLight"/>
-                          <w:color w:val="215E99" w:themeColor="text2" w:themeTint="BF"/>
-                          <w:sz w:val="26"/>
-                          <w:szCs w:val="26"/>
-                          <w:lang w:val="cs-CZ"/>
-                        </w:rPr>
-                        <w:t>PedikuraOrlova</w:t>
-                      </w:r>
-                      <w:r>
-                        <w:rPr>
-                          <w:rFonts w:ascii="Abadi ExtraLight" w:hAnsi="Abadi ExtraLight"/>
-                          <w:sz w:val="26"/>
-                          <w:szCs w:val="26"/>
-                          <w:lang w:val="cs-CZ"/>
-                        </w:rPr>
-                        <w:t>.cz</w:t>
-                      </w:r>
-                      <w:r>
-                        <w:rPr>
-                          <w:rFonts w:ascii="Abadi ExtraLight" w:hAnsi="Abadi ExtraLight"/>
-                          <w:sz w:val="26"/>
-                          <w:szCs w:val="26"/>
-                          <w:lang w:val="cs-CZ"/>
-                        </w:rPr>
-                        <w:br/>
-                      </w:r>
-                      <w:r>
-                        <w:rPr>
-                          <w:rFonts w:ascii="Abadi ExtraLight" w:hAnsi="Abadi ExtraLight"/>
-                          <w:sz w:val="26"/>
-                          <w:szCs w:val="26"/>
-                          <w:lang w:val="cs-CZ"/>
-                        </w:rPr>
-                        <w:t>Masarykova tř. 900</w:t>
-                      </w:r>
-                      <w:r>
-                        <w:rPr>
-                          <w:rFonts w:ascii="Abadi ExtraLight" w:hAnsi="Abadi ExtraLight"/>
-                          <w:sz w:val="26"/>
-                          <w:szCs w:val="26"/>
-                          <w:lang w:val="cs-CZ"/>
-                        </w:rPr>
-                        <w:t xml:space="preserve"> Orlová-</w:t>
-                      </w:r>
-                      <w:proofErr w:type="gramStart"/>
-                      <w:r>
-                        <w:rPr>
-                          <w:rFonts w:ascii="Abadi ExtraLight" w:hAnsi="Abadi ExtraLight"/>
-                          <w:sz w:val="26"/>
-                          <w:szCs w:val="26"/>
-                          <w:lang w:val="cs-CZ"/>
-                        </w:rPr>
-                        <w:t>4-Lutyně</w:t>
-                      </w:r>
-                      <w:proofErr w:type="gramEnd"/>
-                      <w:r>
-                        <w:rPr>
-                          <w:rFonts w:ascii="Abadi ExtraLight" w:hAnsi="Abadi ExtraLight"/>
-                          <w:sz w:val="26"/>
-                          <w:szCs w:val="26"/>
-                          <w:lang w:val="cs-CZ"/>
-                        </w:rPr>
-                        <w:t xml:space="preserve"> (vchod od ul. 17 listopadu)</w:t>
-                      </w:r>
-                    </w:p>
-                  </w:txbxContent>
-                </v:textbox>
-                <w10:wrap type="square" anchorx="margin"/>
-              </v:shape>
-            </w:pict>
-          </mc:Fallback>
-        </mc:AlternateContent>
-      </w:r>
-      <w:r>
-        <w:rPr>
-          <w:noProof/>
-        </w:rPr>
-        <mc:AlternateContent>
-          <mc:Choice Requires="wps">
-            <w:drawing>
-              <wp:anchor distT="45720" distB="45720" distL="114300" distR="114300" simplePos="0" relativeHeight="251665408" behindDoc="0" locked="0" layoutInCell="1" allowOverlap="1" wp14:anchorId="2EEFA056" wp14:editId="7B6FD2A7">
-                <wp:simplePos x="0" y="0"/>
-                <wp:positionH relativeFrom="margin">
-                  <wp:align>left</wp:align>
-                </wp:positionH>
-                <wp:positionV relativeFrom="paragraph">
-                  <wp:posOffset>1725295</wp:posOffset>
-                </wp:positionV>
-                <wp:extent cx="5835015" cy="985520"/>
+                <wp:extent cx="5835015" cy="795020"/>
                 <wp:effectExtent l="0" t="0" r="0" b="5080"/>
                 <wp:wrapSquare wrapText="bothSides"/>
                 <wp:docPr id="1372180985" name="Text Box 2"/>
@@ -526,7 +34,7 @@
                       <wps:spPr bwMode="auto">
                         <a:xfrm>
                           <a:off x="0" y="0"/>
-                          <a:ext cx="5835015" cy="985520"/>
+                          <a:ext cx="5835015" cy="795020"/>
                         </a:xfrm>
                         <a:prstGeom prst="rect">
                           <a:avLst/>
@@ -630,7 +138,11 @@
           </mc:Choice>
           <mc:Fallback>
             <w:pict>
-              <v:shape w14:anchorId="2EEFA056" id="_x0000_s1027" type="#_x0000_t202" style="position:absolute;margin-left:0;margin-top:135.85pt;width:459.45pt;height:77.6pt;z-index:251665408;visibility:visible;mso-wrap-style:square;mso-width-percent:0;mso-height-percent:0;mso-wrap-distance-left:9pt;mso-wrap-distance-top:3.6pt;mso-wrap-distance-right:9pt;mso-wrap-distance-bottom:3.6pt;mso-position-horizontal:left;mso-position-horizontal-relative:margin;mso-position-vertical:absolute;mso-position-vertical-relative:text;mso-width-percent:0;mso-height-percent:0;mso-width-relative:margin;mso-height-relative:margin;v-text-anchor:top" o:gfxdata="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" filled="f" stroked="f">
+              <v:shapetype w14:anchorId="2EEFA056" id="_x0000_t202" coordsize="21600,21600" o:spt="202" path="m,l,21600r21600,l21600,xe">
+                <v:stroke joinstyle="miter"/>
+                <v:path gradientshapeok="t" o:connecttype="rect"/>
+              </v:shapetype>
+              <v:shape id="Text Box 2" o:spid="_x0000_s1026" type="#_x0000_t202" style="position:absolute;margin-left:0;margin-top:126.05pt;width:459.45pt;height:62.6pt;z-index:251665408;visibility:visible;mso-wrap-style:square;mso-width-percent:0;mso-height-percent:0;mso-wrap-distance-left:9pt;mso-wrap-distance-top:3.6pt;mso-wrap-distance-right:9pt;mso-wrap-distance-bottom:3.6pt;mso-position-horizontal:left;mso-position-horizontal-relative:margin;mso-position-vertical:absolute;mso-position-vertical-relative:text;mso-width-percent:0;mso-height-percent:0;mso-width-relative:margin;mso-height-relative:margin;v-text-anchor:top" o:gfxdata="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" filled="f" stroked="f">
                 <v:textbox>
                   <w:txbxContent>
                     <w:p>
@@ -710,6 +222,491 @@
             </w:pict>
           </mc:Fallback>
         </mc:AlternateContent>
+      </w:r>
+      <w:r>
+        <w:rPr>
+          <w:noProof/>
+        </w:rPr>
+        <mc:AlternateContent>
+          <mc:Choice Requires="wps">
+            <w:drawing>
+              <wp:anchor distT="45720" distB="45720" distL="114300" distR="114300" simplePos="0" relativeHeight="251663360" behindDoc="0" locked="0" layoutInCell="1" allowOverlap="1" wp14:anchorId="70EFD44E" wp14:editId="2665FBC8">
+                <wp:simplePos x="0" y="0"/>
+                <wp:positionH relativeFrom="margin">
+                  <wp:align>left</wp:align>
+                </wp:positionH>
+                <wp:positionV relativeFrom="paragraph">
+                  <wp:posOffset>2523490</wp:posOffset>
+                </wp:positionV>
+                <wp:extent cx="5835650" cy="913130"/>
+                <wp:effectExtent l="0" t="0" r="0" b="1270"/>
+                <wp:wrapSquare wrapText="bothSides"/>
+                <wp:docPr id="1512035199" name="Text Box 2"/>
+                <wp:cNvGraphicFramePr>
+                  <a:graphicFrameLocks xmlns:a="http://schemas.openxmlformats.org/drawingml/2006/main"/>
+                </wp:cNvGraphicFramePr>
+                <a:graphic xmlns:a="http://schemas.openxmlformats.org/drawingml/2006/main">
+                  <a:graphicData uri="http://schemas.microsoft.com/office/word/2010/wordprocessingShape">
+                    <wps:wsp>
+                      <wps:cNvSpPr txBox="1">
+                        <a:spLocks noChangeArrowheads="1"/>
+                      </wps:cNvSpPr>
+                      <wps:spPr bwMode="auto">
+                        <a:xfrm>
+                          <a:off x="0" y="0"/>
+                          <a:ext cx="5835650" cy="913130"/>
+                        </a:xfrm>
+                        <a:prstGeom prst="rect">
+                          <a:avLst/>
+                        </a:prstGeom>
+                        <a:noFill/>
+                        <a:ln w="9525">
+                          <a:noFill/>
+                          <a:miter lim="800000"/>
+                          <a:headEnd/>
+                          <a:tailEnd/>
+                        </a:ln>
+                      </wps:spPr>
+                      <wps:txbx>
+                        <w:txbxContent>
+                          <w:p>
+                            <w:pPr>
+                              <w:spacing w:after="0"/>
+                              <w:jc w:val="center"/>
+                              <w:rPr>
+                                <w:rFonts w:ascii="Abadi ExtraLight" w:hAnsi="Abadi ExtraLight"/>
+                                <w:color w:val="215E99" w:themeColor="text2" w:themeTint="BF"/>
+                                <w:sz w:val="26"/>
+                                <w:szCs w:val="26"/>
+                                <w:lang w:val="cs-CZ"/>
+                              </w:rPr>
+                            </w:pPr>
+                            <w:r>
+                              <w:rPr>
+                                <w:rFonts w:ascii="Abadi ExtraLight" w:hAnsi="Abadi ExtraLight"/>
+                                <w:color w:val="215E99" w:themeColor="text2" w:themeTint="BF"/>
+                                <w:sz w:val="26"/>
+                                <w:szCs w:val="26"/>
+                                <w:lang w:val="cs-CZ"/>
+                              </w:rPr>
+                              <w:t>Platnost voucheru 3 měsíce</w:t>
+                            </w:r>
+                          </w:p>
+                          <w:p>
+                            <w:pPr>
+                              <w:spacing w:after="0"/>
+                              <w:jc w:val="center"/>
+                              <w:rPr>
+                                <w:rFonts w:ascii="Abadi ExtraLight" w:hAnsi="Abadi ExtraLight"/>
+                                <w:sz w:val="26"/>
+                                <w:szCs w:val="26"/>
+                                <w:lang w:val="cs-CZ"/>
+                              </w:rPr>
+                            </w:pPr>
+                            <w:r>
+                              <w:rPr>
+                                <w:rFonts w:ascii="Abadi ExtraLight" w:hAnsi="Abadi ExtraLight"/>
+                                <w:sz w:val="26"/>
+                                <w:szCs w:val="26"/>
+                                <w:lang w:val="cs-CZ"/>
+                              </w:rPr>
+                              <w:t xml:space="preserve">Pedikúra Orlová, tel.: +420 </w:t>
+                            </w:r>
+                            <w:r>
+                              <w:rPr>
+                                <w:rFonts w:ascii="Abadi ExtraLight" w:hAnsi="Abadi ExtraLight"/>
+                                <w:b/>
+                                <w:bCs/>
+                                <w:sz w:val="26"/>
+                                <w:szCs w:val="26"/>
+                                <w:lang w:val="cs-CZ"/>
+                              </w:rPr>
+                              <w:t>725 510 642</w:t>
+                            </w:r>
+                          </w:p>
+                          <w:p>
+                            <w:pPr>
+                              <w:spacing w:after="0"/>
+                              <w:jc w:val="center"/>
+                              <w:rPr>
+                                <w:rFonts w:ascii="Abadi ExtraLight" w:hAnsi="Abadi ExtraLight"/>
+                                <w:sz w:val="26"/>
+                                <w:szCs w:val="26"/>
+                              </w:rPr>
+                            </w:pPr>
+                            <w:r>
+                              <w:rPr>
+                                <w:rFonts w:ascii="Abadi ExtraLight" w:hAnsi="Abadi ExtraLight"/>
+                                <w:sz w:val="26"/>
+                                <w:szCs w:val="26"/>
+                                <w:lang w:val="cs-CZ"/>
+                              </w:rPr>
+                              <w:t>email: r.osinova</w:t>
+                            </w:r>
+                            <w:r>
+                              <w:rPr>
+                                <w:rFonts w:ascii="Abadi ExtraLight" w:hAnsi="Abadi ExtraLight"/>
+                                <w:sz w:val="26"/>
+                                <w:szCs w:val="26"/>
+                              </w:rPr>
+                              <w:t xml:space="preserve">@seznam.cz, </w:t>
+                            </w:r>
+                            <w:r>
+                              <w:rPr>
+                                <w:rFonts w:ascii="Abadi ExtraLight" w:hAnsi="Abadi ExtraLight"/>
+                                <w:sz w:val="26"/>
+                                <w:szCs w:val="26"/>
+                                <w:lang w:val="cs-CZ"/>
+                              </w:rPr>
+                              <w:t>www.</w:t>
+                            </w:r>
+                            <w:r>
+                              <w:rPr>
+                                <w:rFonts w:ascii="Abadi ExtraLight" w:hAnsi="Abadi ExtraLight"/>
+                                <w:color w:val="215E99" w:themeColor="text2" w:themeTint="BF"/>
+                                <w:sz w:val="26"/>
+                                <w:szCs w:val="26"/>
+                                <w:lang w:val="cs-CZ"/>
+                              </w:rPr>
+                              <w:t>PedikuraOrlova</w:t>
+                            </w:r>
+                            <w:r>
+                              <w:rPr>
+                                <w:rFonts w:ascii="Abadi ExtraLight" w:hAnsi="Abadi ExtraLight"/>
+                                <w:sz w:val="26"/>
+                                <w:szCs w:val="26"/>
+                                <w:lang w:val="cs-CZ"/>
+                              </w:rPr>
+                              <w:t>.cz</w:t>
+                            </w:r>
+                            <w:r>
+                              <w:rPr>
+                                <w:rFonts w:ascii="Abadi ExtraLight" w:hAnsi="Abadi ExtraLight"/>
+                                <w:sz w:val="26"/>
+                                <w:szCs w:val="26"/>
+                                <w:lang w:val="cs-CZ"/>
+                              </w:rPr>
+                              <w:br/>
+                              <w:t>Masarykova tř. 900 Orlová-</w:t>
+                            </w:r>
+                            <w:proofErr w:type="gramStart"/>
+                            <w:r>
+                              <w:rPr>
+                                <w:rFonts w:ascii="Abadi ExtraLight" w:hAnsi="Abadi ExtraLight"/>
+                                <w:sz w:val="26"/>
+                                <w:szCs w:val="26"/>
+                                <w:lang w:val="cs-CZ"/>
+                              </w:rPr>
+                              <w:t>4-Lutyně</w:t>
+                            </w:r>
+                            <w:proofErr w:type="gramEnd"/>
+                            <w:r>
+                              <w:rPr>
+                                <w:rFonts w:ascii="Abadi ExtraLight" w:hAnsi="Abadi ExtraLight"/>
+                                <w:sz w:val="26"/>
+                                <w:szCs w:val="26"/>
+                                <w:lang w:val="cs-CZ"/>
+                              </w:rPr>
+                              <w:t xml:space="preserve"> (vchod od ul. 17 listopadu)</w:t>
+                            </w:r>
+                          </w:p>
+                        </w:txbxContent>
+                      </wps:txbx>
+                      <wps:bodyPr rot="0" vert="horz" wrap="square" lIns="91440" tIns="45720" rIns="91440" bIns="45720" anchor="t" anchorCtr="0">
+                        <a:noAutofit/>
+                      </wps:bodyPr>
+                    </wps:wsp>
+                  </a:graphicData>
+                </a:graphic>
+                <wp14:sizeRelH relativeFrom="margin">
+                  <wp14:pctWidth>0</wp14:pctWidth>
+                </wp14:sizeRelH>
+                <wp14:sizeRelV relativeFrom="margin">
+                  <wp14:pctHeight>0</wp14:pctHeight>
+                </wp14:sizeRelV>
+              </wp:anchor>
+            </w:drawing>
+          </mc:Choice>
+          <mc:Fallback>
+            <w:pict>
+              <v:shape w14:anchorId="70EFD44E" id="_x0000_s1027" type="#_x0000_t202" style="position:absolute;margin-left:0;margin-top:198.7pt;width:459.5pt;height:71.9pt;z-index:251663360;visibility:visible;mso-wrap-style:square;mso-width-percent:0;mso-height-percent:0;mso-wrap-distance-left:9pt;mso-wrap-distance-top:3.6pt;mso-wrap-distance-right:9pt;mso-wrap-distance-bottom:3.6pt;mso-position-horizontal:left;mso-position-horizontal-relative:margin;mso-position-vertical:absolute;mso-position-vertical-relative:text;mso-width-percent:0;mso-height-percent:0;mso-width-relative:margin;mso-height-relative:margin;v-text-anchor:top" o:gfxdata="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" filled="f" stroked="f">
+                <v:textbox>
+                  <w:txbxContent>
+                    <w:p>
+                      <w:pPr>
+                        <w:spacing w:after="0"/>
+                        <w:jc w:val="center"/>
+                        <w:rPr>
+                          <w:rFonts w:ascii="Abadi ExtraLight" w:hAnsi="Abadi ExtraLight"/>
+                          <w:color w:val="215E99" w:themeColor="text2" w:themeTint="BF"/>
+                          <w:sz w:val="26"/>
+                          <w:szCs w:val="26"/>
+                          <w:lang w:val="cs-CZ"/>
+                        </w:rPr>
+                      </w:pPr>
+                      <w:r>
+                        <w:rPr>
+                          <w:rFonts w:ascii="Abadi ExtraLight" w:hAnsi="Abadi ExtraLight"/>
+                          <w:color w:val="215E99" w:themeColor="text2" w:themeTint="BF"/>
+                          <w:sz w:val="26"/>
+                          <w:szCs w:val="26"/>
+                          <w:lang w:val="cs-CZ"/>
+                        </w:rPr>
+                        <w:t>Platnost voucheru 3 měsíce</w:t>
+                      </w:r>
+                    </w:p>
+                    <w:p>
+                      <w:pPr>
+                        <w:spacing w:after="0"/>
+                        <w:jc w:val="center"/>
+                        <w:rPr>
+                          <w:rFonts w:ascii="Abadi ExtraLight" w:hAnsi="Abadi ExtraLight"/>
+                          <w:sz w:val="26"/>
+                          <w:szCs w:val="26"/>
+                          <w:lang w:val="cs-CZ"/>
+                        </w:rPr>
+                      </w:pPr>
+                      <w:r>
+                        <w:rPr>
+                          <w:rFonts w:ascii="Abadi ExtraLight" w:hAnsi="Abadi ExtraLight"/>
+                          <w:sz w:val="26"/>
+                          <w:szCs w:val="26"/>
+                          <w:lang w:val="cs-CZ"/>
+                        </w:rPr>
+                        <w:t xml:space="preserve">Pedikúra Orlová, tel.: +420 </w:t>
+                      </w:r>
+                      <w:r>
+                        <w:rPr>
+                          <w:rFonts w:ascii="Abadi ExtraLight" w:hAnsi="Abadi ExtraLight"/>
+                          <w:b/>
+                          <w:bCs/>
+                          <w:sz w:val="26"/>
+                          <w:szCs w:val="26"/>
+                          <w:lang w:val="cs-CZ"/>
+                        </w:rPr>
+                        <w:t>725 510 642</w:t>
+                      </w:r>
+                    </w:p>
+                    <w:p>
+                      <w:pPr>
+                        <w:spacing w:after="0"/>
+                        <w:jc w:val="center"/>
+                        <w:rPr>
+                          <w:rFonts w:ascii="Abadi ExtraLight" w:hAnsi="Abadi ExtraLight"/>
+                          <w:sz w:val="26"/>
+                          <w:szCs w:val="26"/>
+                        </w:rPr>
+                      </w:pPr>
+                      <w:r>
+                        <w:rPr>
+                          <w:rFonts w:ascii="Abadi ExtraLight" w:hAnsi="Abadi ExtraLight"/>
+                          <w:sz w:val="26"/>
+                          <w:szCs w:val="26"/>
+                          <w:lang w:val="cs-CZ"/>
+                        </w:rPr>
+                        <w:t>email: r.osinova</w:t>
+                      </w:r>
+                      <w:r>
+                        <w:rPr>
+                          <w:rFonts w:ascii="Abadi ExtraLight" w:hAnsi="Abadi ExtraLight"/>
+                          <w:sz w:val="26"/>
+                          <w:szCs w:val="26"/>
+                        </w:rPr>
+                        <w:t xml:space="preserve">@seznam.cz, </w:t>
+                      </w:r>
+                      <w:r>
+                        <w:rPr>
+                          <w:rFonts w:ascii="Abadi ExtraLight" w:hAnsi="Abadi ExtraLight"/>
+                          <w:sz w:val="26"/>
+                          <w:szCs w:val="26"/>
+                          <w:lang w:val="cs-CZ"/>
+                        </w:rPr>
+                        <w:t>www.</w:t>
+                      </w:r>
+                      <w:r>
+                        <w:rPr>
+                          <w:rFonts w:ascii="Abadi ExtraLight" w:hAnsi="Abadi ExtraLight"/>
+                          <w:color w:val="215E99" w:themeColor="text2" w:themeTint="BF"/>
+                          <w:sz w:val="26"/>
+                          <w:szCs w:val="26"/>
+                          <w:lang w:val="cs-CZ"/>
+                        </w:rPr>
+                        <w:t>PedikuraOrlova</w:t>
+                      </w:r>
+                      <w:r>
+                        <w:rPr>
+                          <w:rFonts w:ascii="Abadi ExtraLight" w:hAnsi="Abadi ExtraLight"/>
+                          <w:sz w:val="26"/>
+                          <w:szCs w:val="26"/>
+                          <w:lang w:val="cs-CZ"/>
+                        </w:rPr>
+                        <w:t>.cz</w:t>
+                      </w:r>
+                      <w:r>
+                        <w:rPr>
+                          <w:rFonts w:ascii="Abadi ExtraLight" w:hAnsi="Abadi ExtraLight"/>
+                          <w:sz w:val="26"/>
+                          <w:szCs w:val="26"/>
+                          <w:lang w:val="cs-CZ"/>
+                        </w:rPr>
+                        <w:br/>
+                        <w:t>Masarykova tř. 900 Orlová-</w:t>
+                      </w:r>
+                      <w:proofErr w:type="gramStart"/>
+                      <w:r>
+                        <w:rPr>
+                          <w:rFonts w:ascii="Abadi ExtraLight" w:hAnsi="Abadi ExtraLight"/>
+                          <w:sz w:val="26"/>
+                          <w:szCs w:val="26"/>
+                          <w:lang w:val="cs-CZ"/>
+                        </w:rPr>
+                        <w:t>4-Lutyně</w:t>
+                      </w:r>
+                      <w:proofErr w:type="gramEnd"/>
+                      <w:r>
+                        <w:rPr>
+                          <w:rFonts w:ascii="Abadi ExtraLight" w:hAnsi="Abadi ExtraLight"/>
+                          <w:sz w:val="26"/>
+                          <w:szCs w:val="26"/>
+                          <w:lang w:val="cs-CZ"/>
+                        </w:rPr>
+                        <w:t xml:space="preserve"> (vchod od ul. 17 listopadu)</w:t>
+                      </w:r>
+                    </w:p>
+                  </w:txbxContent>
+                </v:textbox>
+                <w10:wrap type="square" anchorx="margin"/>
+              </v:shape>
+            </w:pict>
+          </mc:Fallback>
+        </mc:AlternateContent>
+      </w:r>
+      <w:r>
+        <w:rPr>
+          <w:noProof/>
+        </w:rPr>
+        <w:drawing>
+          <wp:anchor distT="0" distB="0" distL="114300" distR="114300" simplePos="0" relativeHeight="251667456" behindDoc="1" locked="0" layoutInCell="1" allowOverlap="1" wp14:anchorId="106A6ED0" wp14:editId="5DC38ACE">
+            <wp:simplePos x="0" y="0"/>
+            <wp:positionH relativeFrom="margin">
+              <wp:posOffset>50242</wp:posOffset>
+            </wp:positionH>
+            <wp:positionV relativeFrom="paragraph">
+              <wp:posOffset>105508</wp:posOffset>
+            </wp:positionV>
+            <wp:extent cx="1371600" cy="1411989"/>
+            <wp:effectExtent l="0" t="0" r="0" b="0"/>
+            <wp:wrapNone/>
+            <wp:docPr id="1629489188" name="Picture 3"/>
+            <wp:cNvGraphicFramePr>
+              <a:graphicFrameLocks xmlns:a="http://schemas.openxmlformats.org/drawingml/2006/main" noChangeAspect="1"/>
+            </wp:cNvGraphicFramePr>
+            <a:graphic xmlns:a="http://schemas.openxmlformats.org/drawingml/2006/main">
+              <a:graphicData uri="http://schemas.openxmlformats.org/drawingml/2006/picture">
+                <pic:pic xmlns:pic="http://schemas.openxmlformats.org/drawingml/2006/picture">
+                  <pic:nvPicPr>
+                    <pic:cNvPr id="0" name="Picture 2"/>
+                    <pic:cNvPicPr>
+                      <a:picLocks noChangeAspect="1" noChangeArrowheads="1"/>
+                    </pic:cNvPicPr>
+                  </pic:nvPicPr>
+                  <pic:blipFill>
+                    <a:blip r:embed="rId4" cstate="print">
+                      <a:extLst>
+                        <a:ext uri="{28A0092B-C50C-407E-A947-70E740481C1C}">
+                          <a14:useLocalDpi xmlns:a14="http://schemas.microsoft.com/office/drawing/2010/main" val="0"/>
+                        </a:ext>
+                      </a:extLst>
+                    </a:blip>
+                    <a:srcRect/>
+                    <a:stretch>
+                      <a:fillRect/>
+                    </a:stretch>
+                  </pic:blipFill>
+                  <pic:spPr bwMode="auto">
+                    <a:xfrm>
+                      <a:off x="0" y="0"/>
+                      <a:ext cx="1384932" cy="1425714"/>
+                    </a:xfrm>
+                    <a:prstGeom prst="rect">
+                      <a:avLst/>
+                    </a:prstGeom>
+                    <a:noFill/>
+                    <a:ln>
+                      <a:noFill/>
+                    </a:ln>
+                  </pic:spPr>
+                </pic:pic>
+              </a:graphicData>
+            </a:graphic>
+            <wp14:sizeRelH relativeFrom="page">
+              <wp14:pctWidth>0</wp14:pctWidth>
+            </wp14:sizeRelH>
+            <wp14:sizeRelV relativeFrom="page">
+              <wp14:pctHeight>0</wp14:pctHeight>
+            </wp14:sizeRelV>
+          </wp:anchor>
+        </w:drawing>
+      </w:r>
+      <w:r>
+        <w:rPr>
+          <w:noProof/>
+        </w:rPr>
+        <w:drawing>
+          <wp:anchor distT="0" distB="0" distL="114300" distR="114300" simplePos="0" relativeHeight="251666432" behindDoc="1" locked="0" layoutInCell="1" allowOverlap="1" wp14:anchorId="41995536" wp14:editId="7FE5AACC">
+            <wp:simplePos x="0" y="0"/>
+            <wp:positionH relativeFrom="column">
+              <wp:posOffset>3856024</wp:posOffset>
+            </wp:positionH>
+            <wp:positionV relativeFrom="paragraph">
+              <wp:posOffset>110794</wp:posOffset>
+            </wp:positionV>
+            <wp:extent cx="1947957" cy="1773140"/>
+            <wp:effectExtent l="0" t="0" r="0" b="0"/>
+            <wp:wrapNone/>
+            <wp:docPr id="537246363" name="Picture 1"/>
+            <wp:cNvGraphicFramePr>
+              <a:graphicFrameLocks xmlns:a="http://schemas.openxmlformats.org/drawingml/2006/main" noChangeAspect="1"/>
+            </wp:cNvGraphicFramePr>
+            <a:graphic xmlns:a="http://schemas.openxmlformats.org/drawingml/2006/main">
+              <a:graphicData uri="http://schemas.openxmlformats.org/drawingml/2006/picture">
+                <pic:pic xmlns:pic="http://schemas.openxmlformats.org/drawingml/2006/picture">
+                  <pic:nvPicPr>
+                    <pic:cNvPr id="537246363" name=""/>
+                    <pic:cNvPicPr/>
+                  </pic:nvPicPr>
+                  <pic:blipFill>
+                    <a:blip r:embed="rId5" cstate="print">
+                      <a:extLst>
+                        <a:ext uri="{28A0092B-C50C-407E-A947-70E740481C1C}">
+                          <a14:useLocalDpi xmlns:a14="http://schemas.microsoft.com/office/drawing/2010/main" val="0"/>
+                        </a:ext>
+                      </a:extLst>
+                    </a:blip>
+                    <a:stretch>
+                      <a:fillRect/>
+                    </a:stretch>
+                  </pic:blipFill>
+                  <pic:spPr>
+                    <a:xfrm rot="10800000">
+                      <a:off x="0" y="0"/>
+                      <a:ext cx="1947957" cy="1773140"/>
+                    </a:xfrm>
+                    <a:prstGeom prst="rect">
+                      <a:avLst/>
+                    </a:prstGeom>
+                  </pic:spPr>
+                </pic:pic>
+              </a:graphicData>
+            </a:graphic>
+            <wp14:sizeRelH relativeFrom="page">
+              <wp14:pctWidth>0</wp14:pctWidth>
+            </wp14:sizeRelH>
+            <wp14:sizeRelV relativeFrom="page">
+              <wp14:pctHeight>0</wp14:pctHeight>
+            </wp14:sizeRelV>
+          </wp:anchor>
+        </w:drawing>
       </w:r>
       <w:r>
         <w:rPr>

</xml_diff>